<commit_message>
Align AI-use statements with the manuscripts and update code downloads
</commit_message>
<xml_diff>
--- a/projects/evidence-model-audit/downloads/manuscript-draft.docx
+++ b/projects/evidence-model-audit/downloads/manuscript-draft.docx
@@ -338,7 +338,7 @@
           <w:i w:val="0"/>
           <w:caps w:val="0"/>
         </w:rPr>
-        <w:t>".[3,4] Physicians wrote each prompt, answered it with one of three labels (significantly increased, no significant difference, significantly decreased) and an evidence span, and verified other annotators' answers. The corpus repository was used at a pinned commit (a661e8c, two commits after its v2.0 tag, differing only in model code) with its official article-level splits, which share no article. The files hold 12,865 prompts and 24,686 annotation rows, and they matched the tarball posted on the project site in prompts, splits, and label codes (Supplementary S1).</w:t>
+        <w:t>".[3,4] Physicians wrote each prompt, answered it with one of three labels (significantly increased, no significant difference, significantly decreased) and an evidence span, and verified other annotators' answers. The corpus repository was used at a pinned commit (a661e8c, two commits after its v2.0 tag, differing only in model code) with its official article-level splits, which share no article. The files hold 12,865 prompts and 24,686 annotation rows, and they matched the tarball posted on the project site in prompts, splits, and label codes (Supplementary File 1, section S1).</w:t>
       </w:r>
     </w:p>
     <w:p>
@@ -516,7 +516,7 @@
           <w:i w:val="0"/>
           <w:caps w:val="0"/>
         </w:rPr>
-        <w:t>Unit tests on synthetic fixtures covered parsing, quote location, the label contract, chunking, and the statistics. A validation stage rebuilt all outputs from cached inputs and compared 4,809 reported numbers with the stored results, recounted the headline aggregates in base R from the item-level files, and regenerated a sample of test calls (40 of 40 identical responses); the final archive was then installed in an empty directory, where its tests passed and its demonstration ran (Supplementary S11). Three amendments to the analysis plan were recorded after test outputs had been generated: the four-word minimum in the exact-match sensitivity analysis, exclusion of the 6 prompts of one test article whose text file is empty, and HTML-entity-aware location of evidence spans, after which the oracle condition was re-run for the 13 prompts per model whose passages changed. None changed the primary estimate (Supplementary S1, S3, and S7). I also checked the primary result and its inputs by hand. I recounted the primary counts (423 of 928) from the item-level file. I compared 20 quote-valid wrong answers, drawn at random with a fixed seed (20261007), with the source articles to confirm that each quote appeared in the article and that the benchmark label reflected the reported result. I checked the label codes of five sampled prompts against the raw annotation file, confirmed that the analysis plan and frozen configuration predated the first language-model test prediction, and checked the descriptions of the five closest prior studies against the papers.</w:t>
+        <w:t>Unit tests on synthetic fixtures covered parsing, quote location, the label contract, chunking, and the statistics. A validation stage rebuilt all outputs from cached inputs and compared 4,809 reported numbers with the stored results, recounted the headline aggregates in base R from the item-level files, and regenerated a sample of test calls (40 of 40 identical responses); the final archive was then installed in an empty directory, where its tests passed and its demonstration ran (Supplementary S11). Three amendments to the analysis plan were recorded after test outputs had been generated: the four-word minimum in the exact-match sensitivity analysis, exclusion of the 6 prompts of one test article whose text file is empty, and HTML-entity-aware location of evidence spans, after which the oracle condition was re-run for the 13 prompts per model whose passages changed. None changed the primary estimate (Supplementary S1, S3, and S7). I also checked the primary result and its inputs by hand. I recounted the primary counts (423 of 928) from the item-level file. I compared 20 quote-valid wrong answers, drawn at random with a fixed seed (20261007), with the source articles to confirm that each quote appeared in the article and that the benchmark label reflected the reported result. I checked the label codes of five sampled prompts against the raw annotation file, confirmed that the analysis plan and frozen configuration predated the first language-model test prediction, and checked the descriptions of the closest prior studies against the papers. A completed TRIPOD-LLM checklist is in Supplementary S12.</w:t>
       </w:r>
     </w:p>
     <w:p>
@@ -4623,7 +4623,7 @@
           <w:i w:val="0"/>
           <w:caps w:val="0"/>
         </w:rPr>
-        <w:t xml:space="preserve">Most quote-valid wrong answers reported a statistically significant effect where the trial reported none, and the model rarely chose "no significant difference" (recall 0.219 for that class, against precision 0.918). A sentence describing a numerical difference can be quoted correctly while its p-value or confidence interval is ignored. About three in ten errors reversed the direction of a significant effect, and most of these answered an increase where the benchmark recorded a decrease (106 of 122), in line with the model's preference for that label (recall 0.926, precision 0.488). Confusing the intervention with the comparator may also contribute: a fine-tuned 4-billion-parameter classifier on the same benchmark kept its direction answer for about a third of prompts when the two were exchanged.[15] </w:t>
+        <w:t xml:space="preserve">Most quote-valid wrong answers reported a statistically significant effect where the trial reported none, and the model rarely chose "no significant difference" (recall 0.219 for that class, against precision 0.918). A sentence describing a numerical difference can be quoted correctly while its p-value or confidence interval is ignored. About three in ten errors reversed the direction of a significant effect, and most of these answered an increase where the benchmark recorded a decrease (106 of 122), in line with the model's preference for that label (recall 0.926, precision 0.488). Confusing the intervention with the comparator may also contribute: a fine-tuned 4-billion-parameter classifier on the same benchmark kept about a third of its direction answers when the two were exchanged.[15] </w:t>
       </w:r>
     </w:p>
     <w:p>
@@ -4844,7 +4844,7 @@
           <w:i w:val="0"/>
           <w:caps w:val="0"/>
         </w:rPr>
-        <w:t>This study was a secondary analysis of published clinical trial reports and existing, publicly available benchmark annotations. No participants were recruited, and no individual-level or identifiable personal data were used. Institutional review board review was not sought.</w:t>
+        <w:t>This study was a secondary analysis of published clinical trial reports and existing, publicly available benchmark annotations. No participants were recruited, and no individual-level or identifiable personal data were used. Institutional review board approval was therefore not required.</w:t>
       </w:r>
     </w:p>
     <w:p>
@@ -5030,7 +5030,7 @@
           <w:i w:val="0"/>
           <w:caps w:val="0"/>
         </w:rPr>
-        <w:t>15. Li JE. Calibrated Answers About Randomized Trials From a 4-Billion-Parameter Open Model: A Registered Test and a License-Clean Release. arXiv:2610.07019. Preprint posted 2026. doi:10.48550/arXiv.2610.07019</w:t>
+        <w:t>15. Li JE. Calibrated Answers About Randomized Trials From a 4-Billion-Parameter Open Model: A Registered Test and a License-Clean Release. arXiv:2610.07019v1. Preprint posted 2026. doi:10.48550/arXiv.2610.07019</w:t>
       </w:r>
     </w:p>
     <w:p>

</xml_diff>